<commit_message>
asset changes and asset log
</commit_message>
<xml_diff>
--- a/Development Diary.docx
+++ b/Development Diary.docx
@@ -119,6 +119,7 @@
       <w:r>
         <w:rPr>
           <w:rFonts w:ascii="Times New Roman" w:hAnsi="Times New Roman" w:cs="Times New Roman"/>
+          <w:noProof/>
           <w:sz w:val="24"/>
           <w:szCs w:val="24"/>
         </w:rPr>
@@ -187,6 +188,7 @@
       <w:r>
         <w:rPr>
           <w:rFonts w:ascii="Times New Roman" w:hAnsi="Times New Roman" w:cs="Times New Roman"/>
+          <w:noProof/>
           <w:color w:val="FF0000"/>
           <w:sz w:val="24"/>
           <w:szCs w:val="24"/>
@@ -255,6 +257,7 @@
       <w:r>
         <w:rPr>
           <w:rFonts w:ascii="Times New Roman" w:hAnsi="Times New Roman" w:cs="Times New Roman"/>
+          <w:noProof/>
           <w:color w:val="FF0000"/>
           <w:sz w:val="24"/>
           <w:szCs w:val="24"/>
@@ -643,6 +646,7 @@
       <w:r>
         <w:rPr>
           <w:rFonts w:ascii="Times New Roman" w:hAnsi="Times New Roman" w:cs="Times New Roman"/>
+          <w:noProof/>
           <w:sz w:val="24"/>
           <w:szCs w:val="24"/>
         </w:rPr>
@@ -694,6 +698,7 @@
       <w:r>
         <w:rPr>
           <w:rFonts w:ascii="Times New Roman" w:hAnsi="Times New Roman" w:cs="Times New Roman"/>
+          <w:noProof/>
           <w:sz w:val="24"/>
           <w:szCs w:val="24"/>
         </w:rPr>
@@ -745,6 +750,7 @@
       <w:r>
         <w:rPr>
           <w:rFonts w:ascii="Times New Roman" w:hAnsi="Times New Roman" w:cs="Times New Roman"/>
+          <w:noProof/>
           <w:sz w:val="24"/>
           <w:szCs w:val="24"/>
         </w:rPr>
@@ -999,16 +1005,14 @@
         <w:br/>
         <w:t xml:space="preserve">Today </w:t>
       </w:r>
-      <w:proofErr w:type="spellStart"/>
-      <w:r>
-        <w:rPr>
-          <w:rFonts w:ascii="Times New Roman" w:hAnsi="Times New Roman" w:cs="Times New Roman"/>
-          <w:sz w:val="24"/>
-          <w:szCs w:val="24"/>
-        </w:rPr>
-        <w:t>i</w:t>
-      </w:r>
-      <w:proofErr w:type="spellEnd"/>
+      <w:r>
+        <w:rPr>
+          <w:rFonts w:ascii="Times New Roman" w:hAnsi="Times New Roman" w:cs="Times New Roman"/>
+          <w:sz w:val="24"/>
+          <w:szCs w:val="24"/>
+        </w:rPr>
+        <w:t>I</w:t>
+      </w:r>
       <w:r>
         <w:rPr>
           <w:rFonts w:ascii="Times New Roman" w:hAnsi="Times New Roman" w:cs="Times New Roman"/>
@@ -1135,6 +1139,7 @@
       <w:r>
         <w:rPr>
           <w:rFonts w:ascii="Times New Roman" w:hAnsi="Times New Roman" w:cs="Times New Roman"/>
+          <w:noProof/>
           <w:sz w:val="24"/>
           <w:szCs w:val="24"/>
         </w:rPr>
@@ -1255,6 +1260,7 @@
       <w:r>
         <w:rPr>
           <w:rFonts w:ascii="Times New Roman" w:hAnsi="Times New Roman" w:cs="Times New Roman"/>
+          <w:noProof/>
           <w:sz w:val="24"/>
           <w:szCs w:val="24"/>
         </w:rPr>
@@ -1342,6 +1348,7 @@
       <w:r>
         <w:rPr>
           <w:rFonts w:ascii="Times New Roman" w:hAnsi="Times New Roman" w:cs="Times New Roman"/>
+          <w:noProof/>
           <w:sz w:val="24"/>
           <w:szCs w:val="24"/>
         </w:rPr>
@@ -1393,6 +1400,7 @@
       <w:r>
         <w:rPr>
           <w:rFonts w:ascii="Times New Roman" w:hAnsi="Times New Roman" w:cs="Times New Roman"/>
+          <w:noProof/>
           <w:sz w:val="24"/>
           <w:szCs w:val="24"/>
         </w:rPr>
@@ -1473,7 +1481,296 @@
           <w:sz w:val="24"/>
           <w:szCs w:val="24"/>
         </w:rPr>
-        <w:br/>
+        <w:drawing>
+          <wp:inline distT="0" distB="0" distL="0" distR="0" wp14:anchorId="091C5159" wp14:editId="1E6973AA">
+            <wp:extent cx="3010320" cy="2133898"/>
+            <wp:effectExtent l="0" t="0" r="0" b="0"/>
+            <wp:docPr id="12" name="Picture 12"/>
+            <wp:cNvGraphicFramePr>
+              <a:graphicFrameLocks xmlns:a="http://schemas.openxmlformats.org/drawingml/2006/main" noChangeAspect="1"/>
+            </wp:cNvGraphicFramePr>
+            <a:graphic xmlns:a="http://schemas.openxmlformats.org/drawingml/2006/main">
+              <a:graphicData uri="http://schemas.openxmlformats.org/drawingml/2006/picture">
+                <pic:pic xmlns:pic="http://schemas.openxmlformats.org/drawingml/2006/picture">
+                  <pic:nvPicPr>
+                    <pic:cNvPr id="1" name=""/>
+                    <pic:cNvPicPr/>
+                  </pic:nvPicPr>
+                  <pic:blipFill>
+                    <a:blip r:embed="rId16"/>
+                    <a:stretch>
+                      <a:fillRect/>
+                    </a:stretch>
+                  </pic:blipFill>
+                  <pic:spPr>
+                    <a:xfrm>
+                      <a:off x="0" y="0"/>
+                      <a:ext cx="3010320" cy="2133898"/>
+                    </a:xfrm>
+                    <a:prstGeom prst="rect">
+                      <a:avLst/>
+                    </a:prstGeom>
+                  </pic:spPr>
+                </pic:pic>
+              </a:graphicData>
+            </a:graphic>
+          </wp:inline>
+        </w:drawing>
+      </w:r>
+    </w:p>
+    <w:p>
+      <w:pPr>
+        <w:rPr>
+          <w:rFonts w:ascii="Times New Roman" w:hAnsi="Times New Roman" w:cs="Times New Roman"/>
+          <w:sz w:val="24"/>
+          <w:szCs w:val="24"/>
+        </w:rPr>
+      </w:pPr>
+      <w:r>
+        <w:rPr>
+          <w:rFonts w:ascii="Times New Roman" w:hAnsi="Times New Roman" w:cs="Times New Roman"/>
+          <w:sz w:val="24"/>
+          <w:szCs w:val="24"/>
+        </w:rPr>
+        <w:drawing>
+          <wp:inline distT="0" distB="0" distL="0" distR="0" wp14:anchorId="7AB194F1" wp14:editId="09ABCEBA">
+            <wp:extent cx="3343742" cy="2105319"/>
+            <wp:effectExtent l="0" t="0" r="9525" b="9525"/>
+            <wp:docPr id="13" name="Picture 13"/>
+            <wp:cNvGraphicFramePr>
+              <a:graphicFrameLocks xmlns:a="http://schemas.openxmlformats.org/drawingml/2006/main" noChangeAspect="1"/>
+            </wp:cNvGraphicFramePr>
+            <a:graphic xmlns:a="http://schemas.openxmlformats.org/drawingml/2006/main">
+              <a:graphicData uri="http://schemas.openxmlformats.org/drawingml/2006/picture">
+                <pic:pic xmlns:pic="http://schemas.openxmlformats.org/drawingml/2006/picture">
+                  <pic:nvPicPr>
+                    <pic:cNvPr id="1" name=""/>
+                    <pic:cNvPicPr/>
+                  </pic:nvPicPr>
+                  <pic:blipFill>
+                    <a:blip r:embed="rId17"/>
+                    <a:stretch>
+                      <a:fillRect/>
+                    </a:stretch>
+                  </pic:blipFill>
+                  <pic:spPr>
+                    <a:xfrm>
+                      <a:off x="0" y="0"/>
+                      <a:ext cx="3343742" cy="2105319"/>
+                    </a:xfrm>
+                    <a:prstGeom prst="rect">
+                      <a:avLst/>
+                    </a:prstGeom>
+                  </pic:spPr>
+                </pic:pic>
+              </a:graphicData>
+            </a:graphic>
+          </wp:inline>
+        </w:drawing>
+      </w:r>
+    </w:p>
+    <w:p>
+      <w:pPr>
+        <w:rPr>
+          <w:rFonts w:ascii="Times New Roman" w:hAnsi="Times New Roman" w:cs="Times New Roman"/>
+          <w:sz w:val="24"/>
+          <w:szCs w:val="24"/>
+        </w:rPr>
+      </w:pPr>
+      <w:r>
+        <w:rPr>
+          <w:rFonts w:ascii="Times New Roman" w:hAnsi="Times New Roman" w:cs="Times New Roman"/>
+          <w:sz w:val="24"/>
+          <w:szCs w:val="24"/>
+        </w:rPr>
+        <w:t>Today I:</w:t>
+      </w:r>
+    </w:p>
+    <w:p>
+      <w:pPr>
+        <w:pStyle w:val="ListParagraph"/>
+        <w:numPr>
+          <w:ilvl w:val="0"/>
+          <w:numId w:val="8"/>
+        </w:numPr>
+        <w:rPr>
+          <w:rFonts w:ascii="Times New Roman" w:hAnsi="Times New Roman" w:cs="Times New Roman"/>
+          <w:sz w:val="24"/>
+          <w:szCs w:val="24"/>
+        </w:rPr>
+      </w:pPr>
+      <w:r>
+        <w:rPr>
+          <w:rFonts w:ascii="Times New Roman" w:hAnsi="Times New Roman" w:cs="Times New Roman"/>
+          <w:sz w:val="24"/>
+          <w:szCs w:val="24"/>
+        </w:rPr>
+        <w:t>Create Basket Controller Logic</w:t>
+      </w:r>
+    </w:p>
+    <w:p>
+      <w:pPr>
+        <w:pStyle w:val="ListParagraph"/>
+        <w:numPr>
+          <w:ilvl w:val="0"/>
+          <w:numId w:val="8"/>
+        </w:numPr>
+        <w:rPr>
+          <w:rFonts w:ascii="Times New Roman" w:hAnsi="Times New Roman" w:cs="Times New Roman"/>
+          <w:sz w:val="24"/>
+          <w:szCs w:val="24"/>
+        </w:rPr>
+      </w:pPr>
+      <w:r>
+        <w:rPr>
+          <w:rFonts w:ascii="Times New Roman" w:hAnsi="Times New Roman" w:cs="Times New Roman"/>
+          <w:sz w:val="24"/>
+          <w:szCs w:val="24"/>
+        </w:rPr>
+        <w:t>Create products controller Logic</w:t>
+      </w:r>
+    </w:p>
+    <w:p>
+      <w:pPr>
+        <w:pStyle w:val="ListParagraph"/>
+        <w:numPr>
+          <w:ilvl w:val="0"/>
+          <w:numId w:val="8"/>
+        </w:numPr>
+        <w:rPr>
+          <w:rFonts w:ascii="Times New Roman" w:hAnsi="Times New Roman" w:cs="Times New Roman"/>
+          <w:sz w:val="24"/>
+          <w:szCs w:val="24"/>
+        </w:rPr>
+      </w:pPr>
+      <w:r>
+        <w:rPr>
+          <w:rFonts w:ascii="Times New Roman" w:hAnsi="Times New Roman" w:cs="Times New Roman"/>
+          <w:sz w:val="24"/>
+          <w:szCs w:val="24"/>
+        </w:rPr>
+        <w:t>Sort out my checkout function</w:t>
+      </w:r>
+    </w:p>
+    <w:p>
+      <w:pPr>
+        <w:pStyle w:val="ListParagraph"/>
+        <w:numPr>
+          <w:ilvl w:val="0"/>
+          <w:numId w:val="8"/>
+        </w:numPr>
+        <w:rPr>
+          <w:rFonts w:ascii="Times New Roman" w:hAnsi="Times New Roman" w:cs="Times New Roman"/>
+          <w:sz w:val="24"/>
+          <w:szCs w:val="24"/>
+        </w:rPr>
+      </w:pPr>
+      <w:r>
+        <w:rPr>
+          <w:rFonts w:ascii="Times New Roman" w:hAnsi="Times New Roman" w:cs="Times New Roman"/>
+          <w:sz w:val="24"/>
+          <w:szCs w:val="24"/>
+        </w:rPr>
+        <w:t>Create demo logo for the producers’ seed data</w:t>
+      </w:r>
+    </w:p>
+    <w:p>
+      <w:pPr>
+        <w:rPr>
+          <w:rFonts w:ascii="Times New Roman" w:hAnsi="Times New Roman" w:cs="Times New Roman"/>
+          <w:sz w:val="24"/>
+          <w:szCs w:val="24"/>
+        </w:rPr>
+      </w:pPr>
+      <w:r>
+        <w:rPr>
+          <w:rFonts w:ascii="Times New Roman" w:hAnsi="Times New Roman" w:cs="Times New Roman"/>
+          <w:sz w:val="24"/>
+          <w:szCs w:val="24"/>
+        </w:rPr>
+        <w:t>Tomorrow I want to:</w:t>
+      </w:r>
+    </w:p>
+    <w:p>
+      <w:pPr>
+        <w:pStyle w:val="ListParagraph"/>
+        <w:numPr>
+          <w:ilvl w:val="0"/>
+          <w:numId w:val="9"/>
+        </w:numPr>
+        <w:rPr>
+          <w:rFonts w:ascii="Times New Roman" w:hAnsi="Times New Roman" w:cs="Times New Roman"/>
+          <w:sz w:val="24"/>
+          <w:szCs w:val="24"/>
+        </w:rPr>
+      </w:pPr>
+      <w:r>
+        <w:rPr>
+          <w:rFonts w:ascii="Times New Roman" w:hAnsi="Times New Roman" w:cs="Times New Roman"/>
+          <w:sz w:val="24"/>
+          <w:szCs w:val="24"/>
+        </w:rPr>
+        <w:t xml:space="preserve">Write out my </w:t>
+      </w:r>
+      <w:r>
+        <w:rPr>
+          <w:rFonts w:ascii="Times New Roman" w:hAnsi="Times New Roman" w:cs="Times New Roman"/>
+          <w:sz w:val="24"/>
+          <w:szCs w:val="24"/>
+        </w:rPr>
+        <w:t xml:space="preserve">cascading styles sheet </w:t>
+      </w:r>
+      <w:r>
+        <w:rPr>
+          <w:rFonts w:ascii="Times New Roman" w:hAnsi="Times New Roman" w:cs="Times New Roman"/>
+          <w:sz w:val="24"/>
+          <w:szCs w:val="24"/>
+        </w:rPr>
+        <w:t>and style my entire website</w:t>
+      </w:r>
+    </w:p>
+    <w:p>
+      <w:pPr>
+        <w:pStyle w:val="ListParagraph"/>
+        <w:numPr>
+          <w:ilvl w:val="0"/>
+          <w:numId w:val="9"/>
+        </w:numPr>
+        <w:rPr>
+          <w:rFonts w:ascii="Times New Roman" w:hAnsi="Times New Roman" w:cs="Times New Roman"/>
+          <w:sz w:val="24"/>
+          <w:szCs w:val="24"/>
+        </w:rPr>
+      </w:pPr>
+      <w:r>
+        <w:rPr>
+          <w:rFonts w:ascii="Times New Roman" w:hAnsi="Times New Roman" w:cs="Times New Roman"/>
+          <w:sz w:val="24"/>
+          <w:szCs w:val="24"/>
+        </w:rPr>
+        <w:t>Create Producer, User and staff dashboards</w:t>
+      </w:r>
+    </w:p>
+    <w:p>
+      <w:pPr>
+        <w:pStyle w:val="ListParagraph"/>
+        <w:numPr>
+          <w:ilvl w:val="0"/>
+          <w:numId w:val="9"/>
+        </w:numPr>
+        <w:rPr>
+          <w:rFonts w:ascii="Times New Roman" w:hAnsi="Times New Roman" w:cs="Times New Roman"/>
+          <w:sz w:val="24"/>
+          <w:szCs w:val="24"/>
+        </w:rPr>
+      </w:pPr>
+      <w:r>
+        <w:rPr>
+          <w:rFonts w:ascii="Times New Roman" w:hAnsi="Times New Roman" w:cs="Times New Roman"/>
+          <w:sz w:val="24"/>
+          <w:szCs w:val="24"/>
+        </w:rPr>
+        <w:t>Add accessibility settings</w:t>
       </w:r>
     </w:p>
     <w:sectPr>
@@ -1489,6 +1786,92 @@
 <file path=word/numbering.xml><?xml version="1.0" encoding="utf-8"?>
 <w:numbering xmlns:wpc="http://schemas.microsoft.com/office/word/2010/wordprocessingCanvas" xmlns:cx="http://schemas.microsoft.com/office/drawing/2014/chartex" xmlns:cx1="http://schemas.microsoft.com/office/drawing/2015/9/8/chartex" xmlns:cx2="http://schemas.microsoft.com/office/drawing/2015/10/21/chartex" xmlns:cx3="http://schemas.microsoft.com/office/drawing/2016/5/9/chartex" xmlns:cx4="http://schemas.microsoft.com/office/drawing/2016/5/10/chartex" xmlns:cx5="http://schemas.microsoft.com/office/drawing/2016/5/11/chartex" xmlns:cx6="http://schemas.microsoft.com/office/drawing/2016/5/12/chartex" xmlns:cx7="http://schemas.microsoft.com/office/drawing/2016/5/13/chartex" xmlns:cx8="http://schemas.microsoft.com/office/drawing/2016/5/14/chartex" xmlns:mc="http://schemas.openxmlformats.org/markup-compatibility/2006" xmlns:aink="http://schemas.microsoft.com/office/drawing/2016/ink" xmlns:am3d="http://schemas.microsoft.com/office/drawing/2017/model3d" xmlns:o="urn:schemas-microsoft-com:office:office" xmlns:r="http://schemas.openxmlformats.org/officeDocument/2006/relationships" xmlns:m="http://schemas.openxmlformats.org/officeDocument/2006/math" xmlns:v="urn:schemas-microsoft-com:vml" xmlns:wp14="http://schemas.microsoft.com/office/word/2010/wordprocessingDrawing" xmlns:wp="http://schemas.openxmlformats.org/drawingml/2006/wordprocessingDrawing" xmlns:w10="urn:schemas-microsoft-com:office:word" xmlns:w="http://schemas.openxmlformats.org/wordprocessingml/2006/main" xmlns:w14="http://schemas.microsoft.com/office/word/2010/wordml" xmlns:w15="http://schemas.microsoft.com/office/word/2012/wordml" xmlns:w16cex="http://schemas.microsoft.com/office/word/2018/wordml/cex" xmlns:w16cid="http://schemas.microsoft.com/office/word/2016/wordml/cid" xmlns:w16="http://schemas.microsoft.com/office/word/2018/wordml" xmlns:w16sdtdh="http://schemas.microsoft.com/office/word/2020/wordml/sdtdatahash" xmlns:w16se="http://schemas.microsoft.com/office/word/2015/wordml/symex" xmlns:wpg="http://schemas.microsoft.com/office/word/2010/wordprocessingGroup" xmlns:wpi="http://schemas.microsoft.com/office/word/2010/wordprocessingInk" xmlns:wne="http://schemas.microsoft.com/office/word/2006/wordml" xmlns:wps="http://schemas.microsoft.com/office/word/2010/wordprocessingShape" mc:Ignorable="w14 w15 w16se w16cid w16 w16cex w16sdtdh wp14">
   <w:abstractNum w:abstractNumId="0" w15:restartNumberingAfterBreak="0">
+    <w:nsid w:val="0C4D14C7"/>
+    <w:multiLevelType w:val="hybridMultilevel"/>
+    <w:tmpl w:val="A6E63C7C"/>
+    <w:lvl w:ilvl="0" w:tplc="0809000F">
+      <w:start w:val="1"/>
+      <w:numFmt w:val="decimal"/>
+      <w:lvlText w:val="%1."/>
+      <w:lvlJc w:val="left"/>
+      <w:pPr>
+        <w:ind w:left="720" w:hanging="360"/>
+      </w:pPr>
+    </w:lvl>
+    <w:lvl w:ilvl="1" w:tplc="08090019" w:tentative="1">
+      <w:start w:val="1"/>
+      <w:numFmt w:val="lowerLetter"/>
+      <w:lvlText w:val="%2."/>
+      <w:lvlJc w:val="left"/>
+      <w:pPr>
+        <w:ind w:left="1440" w:hanging="360"/>
+      </w:pPr>
+    </w:lvl>
+    <w:lvl w:ilvl="2" w:tplc="0809001B" w:tentative="1">
+      <w:start w:val="1"/>
+      <w:numFmt w:val="lowerRoman"/>
+      <w:lvlText w:val="%3."/>
+      <w:lvlJc w:val="right"/>
+      <w:pPr>
+        <w:ind w:left="2160" w:hanging="180"/>
+      </w:pPr>
+    </w:lvl>
+    <w:lvl w:ilvl="3" w:tplc="0809000F" w:tentative="1">
+      <w:start w:val="1"/>
+      <w:numFmt w:val="decimal"/>
+      <w:lvlText w:val="%4."/>
+      <w:lvlJc w:val="left"/>
+      <w:pPr>
+        <w:ind w:left="2880" w:hanging="360"/>
+      </w:pPr>
+    </w:lvl>
+    <w:lvl w:ilvl="4" w:tplc="08090019" w:tentative="1">
+      <w:start w:val="1"/>
+      <w:numFmt w:val="lowerLetter"/>
+      <w:lvlText w:val="%5."/>
+      <w:lvlJc w:val="left"/>
+      <w:pPr>
+        <w:ind w:left="3600" w:hanging="360"/>
+      </w:pPr>
+    </w:lvl>
+    <w:lvl w:ilvl="5" w:tplc="0809001B" w:tentative="1">
+      <w:start w:val="1"/>
+      <w:numFmt w:val="lowerRoman"/>
+      <w:lvlText w:val="%6."/>
+      <w:lvlJc w:val="right"/>
+      <w:pPr>
+        <w:ind w:left="4320" w:hanging="180"/>
+      </w:pPr>
+    </w:lvl>
+    <w:lvl w:ilvl="6" w:tplc="0809000F" w:tentative="1">
+      <w:start w:val="1"/>
+      <w:numFmt w:val="decimal"/>
+      <w:lvlText w:val="%7."/>
+      <w:lvlJc w:val="left"/>
+      <w:pPr>
+        <w:ind w:left="5040" w:hanging="360"/>
+      </w:pPr>
+    </w:lvl>
+    <w:lvl w:ilvl="7" w:tplc="08090019" w:tentative="1">
+      <w:start w:val="1"/>
+      <w:numFmt w:val="lowerLetter"/>
+      <w:lvlText w:val="%8."/>
+      <w:lvlJc w:val="left"/>
+      <w:pPr>
+        <w:ind w:left="5760" w:hanging="360"/>
+      </w:pPr>
+    </w:lvl>
+    <w:lvl w:ilvl="8" w:tplc="0809001B" w:tentative="1">
+      <w:start w:val="1"/>
+      <w:numFmt w:val="lowerRoman"/>
+      <w:lvlText w:val="%9."/>
+      <w:lvlJc w:val="right"/>
+      <w:pPr>
+        <w:ind w:left="6480" w:hanging="180"/>
+      </w:pPr>
+    </w:lvl>
+  </w:abstractNum>
+  <w:abstractNum w:abstractNumId="1" w15:restartNumberingAfterBreak="0">
     <w:nsid w:val="1BEF5316"/>
     <w:multiLevelType w:val="hybridMultilevel"/>
     <w:tmpl w:val="5BDA26B8"/>
@@ -1574,7 +1957,7 @@
       </w:pPr>
     </w:lvl>
   </w:abstractNum>
-  <w:abstractNum w:abstractNumId="1" w15:restartNumberingAfterBreak="0">
+  <w:abstractNum w:abstractNumId="2" w15:restartNumberingAfterBreak="0">
     <w:nsid w:val="30630094"/>
     <w:multiLevelType w:val="hybridMultilevel"/>
     <w:tmpl w:val="C31ED572"/>
@@ -1660,7 +2043,7 @@
       </w:pPr>
     </w:lvl>
   </w:abstractNum>
-  <w:abstractNum w:abstractNumId="2" w15:restartNumberingAfterBreak="0">
+  <w:abstractNum w:abstractNumId="3" w15:restartNumberingAfterBreak="0">
     <w:nsid w:val="4A072FA6"/>
     <w:multiLevelType w:val="hybridMultilevel"/>
     <w:tmpl w:val="6890F314"/>
@@ -1746,7 +2129,7 @@
       </w:pPr>
     </w:lvl>
   </w:abstractNum>
-  <w:abstractNum w:abstractNumId="3" w15:restartNumberingAfterBreak="0">
+  <w:abstractNum w:abstractNumId="4" w15:restartNumberingAfterBreak="0">
     <w:nsid w:val="5E872D5C"/>
     <w:multiLevelType w:val="hybridMultilevel"/>
     <w:tmpl w:val="E1864EEC"/>
@@ -1832,7 +2215,7 @@
       </w:pPr>
     </w:lvl>
   </w:abstractNum>
-  <w:abstractNum w:abstractNumId="4" w15:restartNumberingAfterBreak="0">
+  <w:abstractNum w:abstractNumId="5" w15:restartNumberingAfterBreak="0">
     <w:nsid w:val="62D56080"/>
     <w:multiLevelType w:val="hybridMultilevel"/>
     <w:tmpl w:val="9836D4F6"/>
@@ -1918,7 +2301,93 @@
       </w:pPr>
     </w:lvl>
   </w:abstractNum>
-  <w:abstractNum w:abstractNumId="5" w15:restartNumberingAfterBreak="0">
+  <w:abstractNum w:abstractNumId="6" w15:restartNumberingAfterBreak="0">
+    <w:nsid w:val="708F6AB2"/>
+    <w:multiLevelType w:val="hybridMultilevel"/>
+    <w:tmpl w:val="1CB4A180"/>
+    <w:lvl w:ilvl="0" w:tplc="0809000F">
+      <w:start w:val="1"/>
+      <w:numFmt w:val="decimal"/>
+      <w:lvlText w:val="%1."/>
+      <w:lvlJc w:val="left"/>
+      <w:pPr>
+        <w:ind w:left="720" w:hanging="360"/>
+      </w:pPr>
+    </w:lvl>
+    <w:lvl w:ilvl="1" w:tplc="08090019" w:tentative="1">
+      <w:start w:val="1"/>
+      <w:numFmt w:val="lowerLetter"/>
+      <w:lvlText w:val="%2."/>
+      <w:lvlJc w:val="left"/>
+      <w:pPr>
+        <w:ind w:left="1440" w:hanging="360"/>
+      </w:pPr>
+    </w:lvl>
+    <w:lvl w:ilvl="2" w:tplc="0809001B" w:tentative="1">
+      <w:start w:val="1"/>
+      <w:numFmt w:val="lowerRoman"/>
+      <w:lvlText w:val="%3."/>
+      <w:lvlJc w:val="right"/>
+      <w:pPr>
+        <w:ind w:left="2160" w:hanging="180"/>
+      </w:pPr>
+    </w:lvl>
+    <w:lvl w:ilvl="3" w:tplc="0809000F" w:tentative="1">
+      <w:start w:val="1"/>
+      <w:numFmt w:val="decimal"/>
+      <w:lvlText w:val="%4."/>
+      <w:lvlJc w:val="left"/>
+      <w:pPr>
+        <w:ind w:left="2880" w:hanging="360"/>
+      </w:pPr>
+    </w:lvl>
+    <w:lvl w:ilvl="4" w:tplc="08090019" w:tentative="1">
+      <w:start w:val="1"/>
+      <w:numFmt w:val="lowerLetter"/>
+      <w:lvlText w:val="%5."/>
+      <w:lvlJc w:val="left"/>
+      <w:pPr>
+        <w:ind w:left="3600" w:hanging="360"/>
+      </w:pPr>
+    </w:lvl>
+    <w:lvl w:ilvl="5" w:tplc="0809001B" w:tentative="1">
+      <w:start w:val="1"/>
+      <w:numFmt w:val="lowerRoman"/>
+      <w:lvlText w:val="%6."/>
+      <w:lvlJc w:val="right"/>
+      <w:pPr>
+        <w:ind w:left="4320" w:hanging="180"/>
+      </w:pPr>
+    </w:lvl>
+    <w:lvl w:ilvl="6" w:tplc="0809000F" w:tentative="1">
+      <w:start w:val="1"/>
+      <w:numFmt w:val="decimal"/>
+      <w:lvlText w:val="%7."/>
+      <w:lvlJc w:val="left"/>
+      <w:pPr>
+        <w:ind w:left="5040" w:hanging="360"/>
+      </w:pPr>
+    </w:lvl>
+    <w:lvl w:ilvl="7" w:tplc="08090019" w:tentative="1">
+      <w:start w:val="1"/>
+      <w:numFmt w:val="lowerLetter"/>
+      <w:lvlText w:val="%8."/>
+      <w:lvlJc w:val="left"/>
+      <w:pPr>
+        <w:ind w:left="5760" w:hanging="360"/>
+      </w:pPr>
+    </w:lvl>
+    <w:lvl w:ilvl="8" w:tplc="0809001B" w:tentative="1">
+      <w:start w:val="1"/>
+      <w:numFmt w:val="lowerRoman"/>
+      <w:lvlText w:val="%9."/>
+      <w:lvlJc w:val="right"/>
+      <w:pPr>
+        <w:ind w:left="6480" w:hanging="180"/>
+      </w:pPr>
+    </w:lvl>
+  </w:abstractNum>
+  <w:abstractNum w:abstractNumId="7" w15:restartNumberingAfterBreak="0">
     <w:nsid w:val="789D6AB5"/>
     <w:multiLevelType w:val="hybridMultilevel"/>
     <w:tmpl w:val="D584E204"/>
@@ -2004,7 +2473,7 @@
       </w:pPr>
     </w:lvl>
   </w:abstractNum>
-  <w:abstractNum w:abstractNumId="6" w15:restartNumberingAfterBreak="0">
+  <w:abstractNum w:abstractNumId="8" w15:restartNumberingAfterBreak="0">
     <w:nsid w:val="79B14F8E"/>
     <w:multiLevelType w:val="hybridMultilevel"/>
     <w:tmpl w:val="D7709680"/>
@@ -2118,24 +2587,30 @@
     </w:lvl>
   </w:abstractNum>
   <w:num w:numId="1">
+    <w:abstractNumId w:val="7"/>
+  </w:num>
+  <w:num w:numId="2">
+    <w:abstractNumId w:val="3"/>
+  </w:num>
+  <w:num w:numId="3">
+    <w:abstractNumId w:val="4"/>
+  </w:num>
+  <w:num w:numId="4">
+    <w:abstractNumId w:val="8"/>
+  </w:num>
+  <w:num w:numId="5">
     <w:abstractNumId w:val="5"/>
   </w:num>
-  <w:num w:numId="2">
+  <w:num w:numId="6">
     <w:abstractNumId w:val="2"/>
   </w:num>
-  <w:num w:numId="3">
-    <w:abstractNumId w:val="3"/>
+  <w:num w:numId="7">
+    <w:abstractNumId w:val="1"/>
   </w:num>
-  <w:num w:numId="4">
+  <w:num w:numId="8">
     <w:abstractNumId w:val="6"/>
   </w:num>
-  <w:num w:numId="5">
-    <w:abstractNumId w:val="4"/>
-  </w:num>
-  <w:num w:numId="6">
-    <w:abstractNumId w:val="1"/>
-  </w:num>
-  <w:num w:numId="7">
+  <w:num w:numId="9">
     <w:abstractNumId w:val="0"/>
   </w:num>
 </w:numbering>

</xml_diff>